<commit_message>
docxref: merge replaces a style in place (pandoc's order kept, new styles appended), as the shell builders did; replace mode emits no empty slot; bap8, iasd and njd re-rendered, docx checks green (fb-595.63)
</commit_message>
<xml_diff>
--- a/courts/eighth-circuit/iowa/federal/southern-district/motion-brief/usage/OUTPUT-motion-brief.docx
+++ b/courts/eighth-circuit/iowa/federal/southern-district/motion-brief/usage/OUTPUT-motion-brief.docx
@@ -2023,6 +2023,46 @@
     </w:pPrDefault>
   </w:docDefaults>
   <w:latentStyles w:defLockedState="0" w:defUIPriority="0" w:defSemiHidden="0" w:defUnhideWhenUsed="0" w:defQFormat="0" w:count="276"/>
+  <w:style w:type="paragraph" w:default="1" w:styleId="Normal">
+    <w:name w:val="Normal"/>
+    <w:qFormat/>
+    <w:pPr>
+      <w:spacing w:before="0" w:after="0" w:line="480" w:lineRule="exact"/>
+    </w:pPr>
+    <w:rPr>
+      <w:rFonts w:ascii="Times New Roman" w:hAnsi="Times New Roman" w:eastAsia="Times New Roman" w:cs="Times New Roman"/>
+      <w:sz w:val="24"/>
+      <w:szCs w:val="24"/>
+    </w:rPr>
+  </w:style>
+  <w:style w:type="paragraph" w:styleId="BodyText">
+    <w:name w:val="Body Text"/>
+    <w:basedOn w:val="Normal"/>
+    <w:qFormat/>
+    <w:pPr>
+      <w:spacing w:before="0" w:after="0" w:line="480" w:lineRule="exact"/>
+      <w:ind w:firstLine="720"/>
+    </w:pPr>
+  </w:style>
+  <w:style w:type="paragraph" w:customStyle="1" w:styleId="FirstParagraph">
+    <w:name w:val="First Paragraph"/>
+    <w:basedOn w:val="BodyText"/>
+    <w:next w:val="BodyText"/>
+    <w:qFormat/>
+    <w:pPr>
+      <w:spacing w:before="0" w:after="0" w:line="480" w:lineRule="exact"/>
+      <w:ind w:firstLine="720"/>
+    </w:pPr>
+  </w:style>
+  <w:style w:type="paragraph" w:customStyle="1" w:styleId="Compact">
+    <w:name w:val="Compact"/>
+    <w:basedOn w:val="BodyText"/>
+    <w:qFormat/>
+    <w:pPr>
+      <w:spacing w:before="0" w:after="0" w:line="480" w:lineRule="exact"/>
+      <w:ind w:firstLine="0"/>
+    </w:pPr>
+  </w:style>
   <w:style w:type="paragraph" w:styleId="Title">
     <w:name w:val="Title"/>
     <w:basedOn w:val="Normal"/>
@@ -2155,6 +2195,91 @@
     <w:qFormat/>
     <w:pPr/>
     <w:rPr/>
+  </w:style>
+  <w:style w:type="paragraph" w:styleId="Heading1">
+    <w:name w:val="heading 1"/>
+    <w:basedOn w:val="Normal"/>
+    <w:next w:val="BodyText"/>
+    <w:qFormat/>
+    <w:pPr>
+      <w:keepNext/>
+      <w:keepLines/>
+      <w:spacing w:before="240" w:after="240" w:line="480" w:lineRule="exact"/>
+      <w:ind w:firstLine="0"/>
+      <w:jc w:val="center"/>
+      <w:outlineLvl w:val="0"/>
+    </w:pPr>
+    <w:rPr>
+      <w:b/>
+      <w:bCs/>
+      <w:caps/>
+      <w:color w:val="000000"/>
+      <w:sz w:val="24"/>
+      <w:szCs w:val="24"/>
+    </w:rPr>
+  </w:style>
+  <w:style w:type="paragraph" w:styleId="Heading2">
+    <w:name w:val="heading 2"/>
+    <w:basedOn w:val="Normal"/>
+    <w:next w:val="BodyText"/>
+    <w:qFormat/>
+    <w:pPr>
+      <w:keepNext/>
+      <w:keepLines/>
+      <w:spacing w:before="240" w:after="240" w:line="480" w:lineRule="exact"/>
+      <w:ind w:left="720" w:hanging="720"/>
+      <w:jc w:val="left"/>
+      <w:outlineLvl w:val="1"/>
+    </w:pPr>
+    <w:rPr>
+      <w:b/>
+      <w:bCs/>
+      <w:color w:val="000000"/>
+      <w:sz w:val="24"/>
+      <w:szCs w:val="24"/>
+    </w:rPr>
+  </w:style>
+  <w:style w:type="paragraph" w:styleId="Heading3">
+    <w:name w:val="heading 3"/>
+    <w:basedOn w:val="Normal"/>
+    <w:next w:val="BodyText"/>
+    <w:qFormat/>
+    <w:pPr>
+      <w:keepNext/>
+      <w:keepLines/>
+      <w:spacing w:before="240" w:after="240" w:line="480" w:lineRule="exact"/>
+      <w:ind w:left="1440" w:hanging="720"/>
+      <w:jc w:val="left"/>
+      <w:outlineLvl w:val="2"/>
+    </w:pPr>
+    <w:rPr>
+      <w:b/>
+      <w:bCs/>
+      <w:color w:val="000000"/>
+      <w:sz w:val="24"/>
+      <w:szCs w:val="24"/>
+    </w:rPr>
+  </w:style>
+  <w:style w:type="paragraph" w:styleId="Heading4">
+    <w:name w:val="heading 4"/>
+    <w:basedOn w:val="Normal"/>
+    <w:next w:val="BodyText"/>
+    <w:qFormat/>
+    <w:pPr>
+      <w:keepNext/>
+      <w:keepLines/>
+      <w:spacing w:before="240" w:after="240" w:line="480" w:lineRule="exact"/>
+      <w:ind w:left="2160" w:hanging="720"/>
+      <w:jc w:val="left"/>
+      <w:outlineLvl w:val="3"/>
+    </w:pPr>
+    <w:rPr>
+      <w:b/>
+      <w:bCs/>
+      <w:color w:val="000000"/>
+      <w:sz w:val="24"/>
+      <w:szCs w:val="24"/>
+    </w:rPr>
   </w:style>
   <w:style w:type="paragraph" w:styleId="Heading5">
     <w:name w:val="heading 5"/>
@@ -2382,6 +2507,27 @@
     <w:rPr>
       <w:rFonts w:eastAsiaTheme="majorEastAsia" w:cstheme="majorBidi"/>
       <w:color w:val="272727" w:themeColor="text1" w:themeTint="D8"/>
+    </w:rPr>
+  </w:style>
+  <w:style w:type="paragraph" w:styleId="BlockText">
+    <w:name w:val="Block Text"/>
+    <w:basedOn w:val="Normal"/>
+    <w:qFormat/>
+    <w:pPr>
+      <w:spacing w:before="0" w:after="240" w:line="280" w:lineRule="exact"/>
+      <w:ind w:left="720" w:right="720" w:firstLine="0"/>
+    </w:pPr>
+  </w:style>
+  <w:style w:type="paragraph" w:styleId="FootnoteText">
+    <w:name w:val="footnote text"/>
+    <w:basedOn w:val="Normal"/>
+    <w:pPr>
+      <w:spacing w:before="0" w:after="120" w:line="280" w:lineRule="exact"/>
+      <w:ind w:firstLine="0"/>
+    </w:pPr>
+    <w:rPr>
+      <w:sz w:val="24"/>
+      <w:szCs w:val="24"/>
     </w:rPr>
   </w:style>
   <w:style w:type="paragraph" w:styleId="FootnoteBlockText">
@@ -2520,152 +2666,6 @@
       <w:b w:val="0"/>
       <w:bCs w:val="0"/>
       <w:color w:val="365F91" w:themeColor="accent1" w:themeShade="BF"/>
-    </w:rPr>
-  </w:style>
-  <w:style w:type="paragraph" w:default="1" w:styleId="Normal">
-    <w:name w:val="Normal"/>
-    <w:qFormat/>
-    <w:pPr>
-      <w:spacing w:before="0" w:after="0" w:line="480" w:lineRule="exact"/>
-    </w:pPr>
-    <w:rPr>
-      <w:rFonts w:ascii="Times New Roman" w:hAnsi="Times New Roman" w:eastAsia="Times New Roman" w:cs="Times New Roman"/>
-      <w:sz w:val="24"/>
-      <w:szCs w:val="24"/>
-    </w:rPr>
-  </w:style>
-  <w:style w:type="paragraph" w:styleId="BodyText">
-    <w:name w:val="Body Text"/>
-    <w:basedOn w:val="Normal"/>
-    <w:qFormat/>
-    <w:pPr>
-      <w:spacing w:before="0" w:after="0" w:line="480" w:lineRule="exact"/>
-      <w:ind w:firstLine="720"/>
-    </w:pPr>
-  </w:style>
-  <w:style w:type="paragraph" w:customStyle="1" w:styleId="FirstParagraph">
-    <w:name w:val="First Paragraph"/>
-    <w:basedOn w:val="BodyText"/>
-    <w:next w:val="BodyText"/>
-    <w:qFormat/>
-    <w:pPr>
-      <w:spacing w:before="0" w:after="0" w:line="480" w:lineRule="exact"/>
-      <w:ind w:firstLine="720"/>
-    </w:pPr>
-  </w:style>
-  <w:style w:type="paragraph" w:customStyle="1" w:styleId="Compact">
-    <w:name w:val="Compact"/>
-    <w:basedOn w:val="BodyText"/>
-    <w:qFormat/>
-    <w:pPr>
-      <w:spacing w:before="0" w:after="0" w:line="480" w:lineRule="exact"/>
-      <w:ind w:firstLine="0"/>
-    </w:pPr>
-  </w:style>
-  <w:style w:type="paragraph" w:styleId="BlockText">
-    <w:name w:val="Block Text"/>
-    <w:basedOn w:val="Normal"/>
-    <w:qFormat/>
-    <w:pPr>
-      <w:spacing w:before="0" w:after="240" w:line="280" w:lineRule="exact"/>
-      <w:ind w:left="720" w:right="720" w:firstLine="0"/>
-    </w:pPr>
-  </w:style>
-  <w:style w:type="paragraph" w:styleId="FootnoteText">
-    <w:name w:val="footnote text"/>
-    <w:basedOn w:val="Normal"/>
-    <w:pPr>
-      <w:spacing w:before="0" w:after="120" w:line="280" w:lineRule="exact"/>
-      <w:ind w:firstLine="0"/>
-    </w:pPr>
-    <w:rPr>
-      <w:sz w:val="24"/>
-      <w:szCs w:val="24"/>
-    </w:rPr>
-  </w:style>
-  <w:style w:type="paragraph" w:styleId="Heading1">
-    <w:name w:val="heading 1"/>
-    <w:basedOn w:val="Normal"/>
-    <w:next w:val="BodyText"/>
-    <w:qFormat/>
-    <w:pPr>
-      <w:keepNext/>
-      <w:keepLines/>
-      <w:spacing w:before="240" w:after="240" w:line="480" w:lineRule="exact"/>
-      <w:ind w:firstLine="0"/>
-      <w:jc w:val="center"/>
-      <w:outlineLvl w:val="0"/>
-    </w:pPr>
-    <w:rPr>
-      <w:b/>
-      <w:bCs/>
-      <w:caps/>
-      <w:color w:val="000000"/>
-      <w:sz w:val="24"/>
-      <w:szCs w:val="24"/>
-    </w:rPr>
-  </w:style>
-  <w:style w:type="paragraph" w:styleId="Heading2">
-    <w:name w:val="heading 2"/>
-    <w:basedOn w:val="Normal"/>
-    <w:next w:val="BodyText"/>
-    <w:qFormat/>
-    <w:pPr>
-      <w:keepNext/>
-      <w:keepLines/>
-      <w:spacing w:before="240" w:after="240" w:line="480" w:lineRule="exact"/>
-      <w:ind w:left="720" w:hanging="720"/>
-      <w:jc w:val="left"/>
-      <w:outlineLvl w:val="1"/>
-    </w:pPr>
-    <w:rPr>
-      <w:b/>
-      <w:bCs/>
-      <w:color w:val="000000"/>
-      <w:sz w:val="24"/>
-      <w:szCs w:val="24"/>
-    </w:rPr>
-  </w:style>
-  <w:style w:type="paragraph" w:styleId="Heading3">
-    <w:name w:val="heading 3"/>
-    <w:basedOn w:val="Normal"/>
-    <w:next w:val="BodyText"/>
-    <w:qFormat/>
-    <w:pPr>
-      <w:keepNext/>
-      <w:keepLines/>
-      <w:spacing w:before="240" w:after="240" w:line="480" w:lineRule="exact"/>
-      <w:ind w:left="1440" w:hanging="720"/>
-      <w:jc w:val="left"/>
-      <w:outlineLvl w:val="2"/>
-    </w:pPr>
-    <w:rPr>
-      <w:b/>
-      <w:bCs/>
-      <w:color w:val="000000"/>
-      <w:sz w:val="24"/>
-      <w:szCs w:val="24"/>
-    </w:rPr>
-  </w:style>
-  <w:style w:type="paragraph" w:styleId="Heading4">
-    <w:name w:val="heading 4"/>
-    <w:basedOn w:val="Normal"/>
-    <w:next w:val="BodyText"/>
-    <w:qFormat/>
-    <w:pPr>
-      <w:keepNext/>
-      <w:keepLines/>
-      <w:spacing w:before="240" w:after="240" w:line="480" w:lineRule="exact"/>
-      <w:ind w:left="2160" w:hanging="720"/>
-      <w:jc w:val="left"/>
-      <w:outlineLvl w:val="3"/>
-    </w:pPr>
-    <w:rPr>
-      <w:b/>
-      <w:bCs/>
-      <w:color w:val="000000"/>
-      <w:sz w:val="24"/>
-      <w:szCs w:val="24"/>
     </w:rPr>
   </w:style>
   <w:style w:type="paragraph" w:customStyle="1" w:styleId="SourceCode">

</xml_diff>